<commit_message>
Kim12-2-9-Fonksiyonel-Gruplar: gorsel alanlarina Shutter onizlemeleri yerlestirildi (2.3 bicimi)
</commit_message>
<xml_diff>
--- a/Kim12-2-9-Fonksiyonel-Gruplar.docx
+++ b/Kim12-2-9-Fonksiyonel-Gruplar.docx
@@ -39,85 +39,59 @@
         <w:t xml:space="preserve">Evinizde ellerinizi temizlemek için kullandığınız dezenfektan, ojeyi çıkarmak için kullanılan aseton ve salatalara eklenen sirke keskin ama birbirinden farklı kokulara sahiptir (Görsel A). Dezenfektan ve aseton kolayca alev alırken sirke yanıcı değildir; sirkenin ekşi tadı ise diğerlerinde yoktur. Muzun, ananasın ya da çileğin hoş kokusu da yine karbon, hidrojen ve oksijen atomlarından oluşan moleküllerden kaynaklanır. Bu maddelerin hepsi karbon zinciri içeren organik bileşiklerdir. Peki aynı tür atomlardan oluşan bu maddelerin özellikleri neden bu kadar farklıdır? Moleküllerin hangi kısmı özelliklerinin belirlenmesinde etkilidir? Bu bileşikler hangi ölçütlerle gruplandırılabilir?</w:t>
       </w:r>
     </w:p>
-    <w:tbl>
-      <w:tblPr>
-        <w:tblW w:w="9000" w:type="dxa"/>
+    <w:p>
+      <w:pPr>
         <w:jc w:val="center"/>
-        <w:tblBorders>
-          <w:top w:val="single" w:sz="8" w:space="0" w:color="7F7F7F"/>
-          <w:left w:val="single" w:sz="8" w:space="0" w:color="7F7F7F"/>
-          <w:bottom w:val="single" w:sz="8" w:space="0" w:color="7F7F7F"/>
-          <w:right w:val="single" w:sz="8" w:space="0" w:color="7F7F7F"/>
-        </w:tblBorders>
-      </w:tblPr>
-      <w:tblGrid>
-        <w:gridCol w:w="9000"/>
-      </w:tblGrid>
-      <w:tr>
-        <w:tc>
-          <w:tcPr>
-            <w:tcW w:w="9000" w:type="dxa"/>
-            <w:shd w:val="clear" w:color="auto" w:fill="EDEDED"/>
-          </w:tcPr>
-          <w:p>
-            <w:pPr>
-              <w:jc w:val="both"/>
-              <w:rPr>
-                <w:rFonts w:ascii="Times New Roman" w:hAnsi="Times New Roman" w:cs="Times New Roman"/>
-                <w:lang w:val="tr-TR"/>
-              </w:rPr>
-            </w:pPr>
-            <w:r>
-              <w:rPr>
-                <w:rFonts w:ascii="Times New Roman" w:hAnsi="Times New Roman" w:cs="Times New Roman"/>
-                <w:lang w:val="tr-TR"/>
-              </w:rPr>
-              <w:t xml:space="preserve">GÖRSEL ALANI (Shutterstock)</w:t>
-            </w:r>
-          </w:p>
-          <w:p>
-            <w:pPr>
-              <w:jc w:val="both"/>
-              <w:rPr>
-                <w:rFonts w:ascii="Times New Roman" w:hAnsi="Times New Roman" w:cs="Times New Roman"/>
-                <w:lang w:val="tr-TR"/>
-              </w:rPr>
-            </w:pPr>
-            <w:r>
-              <w:rPr>
-                <w:rFonts w:ascii="Times New Roman" w:hAnsi="Times New Roman" w:cs="Times New Roman"/>
-                <w:lang w:val="tr-TR"/>
-              </w:rPr>
-              <w:t xml:space="preserve">Tarif: Masa üzerinde etiketi okunmayan bir el dezenfektanı şişesi, oje çıkarıcı şişesi ve cam şişede sirke; yanlarında dilimlenmiş elma. Marka ve logo görünmesin.</w:t>
-            </w:r>
-          </w:p>
-          <w:p>
-            <w:pPr>
-              <w:jc w:val="both"/>
-              <w:rPr>
-                <w:rFonts w:ascii="Times New Roman" w:hAnsi="Times New Roman" w:cs="Times New Roman"/>
-                <w:lang w:val="tr-TR"/>
-              </w:rPr>
-            </w:pPr>
-            <w:r>
-              <w:rPr>
-                <w:rFonts w:ascii="Times New Roman" w:hAnsi="Times New Roman" w:cs="Times New Roman"/>
-                <w:lang w:val="tr-TR"/>
-              </w:rPr>
-              <w:t xml:space="preserve">Shutter ID: 1461876668 (fotoğraf) — Bottle of acetone nail polish remover in hand</w:t>
-            </w:r>
-          </w:p>
-        </w:tc>
-      </w:tr>
-    </w:tbl>
+      </w:pPr>
+      <w:r>
+        <w:drawing>
+          <wp:inline xmlns:a="http://schemas.openxmlformats.org/drawingml/2006/main" xmlns:pic="http://schemas.openxmlformats.org/drawingml/2006/picture">
+            <wp:extent cx="3458371" cy="2520000"/>
+            <wp:docPr id="900009" name="Picture 900009"/>
+            <wp:cNvGraphicFramePr>
+              <a:graphicFrameLocks noChangeAspect="1"/>
+            </wp:cNvGraphicFramePr>
+            <a:graphic>
+              <a:graphicData uri="http://schemas.openxmlformats.org/drawingml/2006/picture">
+                <pic:pic>
+                  <pic:nvPicPr>
+                    <pic:cNvPr id="0" name="1461876668_d.jpg"/>
+                    <pic:cNvPicPr/>
+                  </pic:nvPicPr>
+                  <pic:blipFill>
+                    <a:blip r:embed="rId11"/>
+                    <a:stretch>
+                      <a:fillRect/>
+                    </a:stretch>
+                  </pic:blipFill>
+                  <pic:spPr>
+                    <a:xfrm>
+                      <a:off x="0" y="0"/>
+                      <a:ext cx="3458371" cy="2520000"/>
+                    </a:xfrm>
+                    <a:prstGeom prst="rect"/>
+                  </pic:spPr>
+                </pic:pic>
+              </a:graphicData>
+            </a:graphic>
+          </wp:inline>
+        </w:drawing>
+      </w:r>
+    </w:p>
     <w:p>
       <w:pPr>
-        <w:jc w:val="both"/>
-        <w:rPr>
-          <w:rFonts w:ascii="Times New Roman" w:hAnsi="Times New Roman" w:cs="Times New Roman"/>
-          <w:lang w:val="tr-TR"/>
-        </w:rPr>
-      </w:pPr>
+        <w:jc w:val="center"/>
+      </w:pPr>
+      <w:r>
+        <w:rPr>
+          <w:rFonts w:ascii="Times New Roman" w:hAnsi="Times New Roman" w:cs="Times New Roman"/>
+          <w:b/>
+          <w:bCs/>
+          <w:highlight w:val="yellow"/>
+          <w:lang w:val="tr-TR"/>
+        </w:rPr>
+        <w:t xml:space="preserve">Shutter id: 1461876668</w:t>
+      </w:r>
     </w:p>
     <w:p>
       <w:pPr>
@@ -8290,85 +8264,59 @@
         <w:t xml:space="preserve">Türkiye, iklim koşulları sayesinde kozmetik, parfümeri ve gıda sektörlerine ham madde sağlayan birçok bitkinin yetiştiği bir ülkedir. Isparta ve çevresinde yetiştirilen yağ gülünden elde edilen gül yağı, dünyada parfüm ve kozmetik sanayisinde aranan değerli bir üründür. Gül yağının kendine özgü kokusunu veren bileşenlerin önemli bir kısmı sitronellol, geraniol ve feniletil alkol gibi alkollerdir. Bir kilogram gül yağı elde etmek için tonlarca gül yaprağının damıtılması gerekir. Yaşadığınız bölgede yetişen bitkilerin içerdiği organik bileşikleri ve bu bileşiklerin hangi fonksiyonel gruplara sahip olduğunu araştırarak sınıfınızda paylaşabilirsiniz.</w:t>
       </w:r>
     </w:p>
-    <w:tbl>
-      <w:tblPr>
-        <w:tblW w:w="9000" w:type="dxa"/>
+    <w:p>
+      <w:pPr>
         <w:jc w:val="center"/>
-        <w:tblBorders>
-          <w:top w:val="single" w:sz="8" w:space="0" w:color="7F7F7F"/>
-          <w:left w:val="single" w:sz="8" w:space="0" w:color="7F7F7F"/>
-          <w:bottom w:val="single" w:sz="8" w:space="0" w:color="7F7F7F"/>
-          <w:right w:val="single" w:sz="8" w:space="0" w:color="7F7F7F"/>
-        </w:tblBorders>
-      </w:tblPr>
-      <w:tblGrid>
-        <w:gridCol w:w="9000"/>
-      </w:tblGrid>
-      <w:tr>
-        <w:tc>
-          <w:tcPr>
-            <w:tcW w:w="9000" w:type="dxa"/>
-            <w:shd w:val="clear" w:color="auto" w:fill="EDEDED"/>
-          </w:tcPr>
-          <w:p>
-            <w:pPr>
-              <w:jc w:val="both"/>
-              <w:rPr>
-                <w:rFonts w:ascii="Times New Roman" w:hAnsi="Times New Roman" w:cs="Times New Roman"/>
-                <w:lang w:val="tr-TR"/>
-              </w:rPr>
-            </w:pPr>
-            <w:r>
-              <w:rPr>
-                <w:rFonts w:ascii="Times New Roman" w:hAnsi="Times New Roman" w:cs="Times New Roman"/>
-                <w:lang w:val="tr-TR"/>
-              </w:rPr>
-              <w:t xml:space="preserve">GÖRSEL ALANI (Shutterstock)</w:t>
-            </w:r>
-          </w:p>
-          <w:p>
-            <w:pPr>
-              <w:jc w:val="both"/>
-              <w:rPr>
-                <w:rFonts w:ascii="Times New Roman" w:hAnsi="Times New Roman" w:cs="Times New Roman"/>
-                <w:lang w:val="tr-TR"/>
-              </w:rPr>
-            </w:pPr>
-            <w:r>
-              <w:rPr>
-                <w:rFonts w:ascii="Times New Roman" w:hAnsi="Times New Roman" w:cs="Times New Roman"/>
-                <w:lang w:val="tr-TR"/>
-              </w:rPr>
-              <w:t xml:space="preserve">Tarif: Sabah saatlerinde pembe yağ gülü tarlasında sepetlere gül toplanması; yakın plan gül çiçekleri.</w:t>
-            </w:r>
-          </w:p>
-          <w:p>
-            <w:pPr>
-              <w:jc w:val="both"/>
-              <w:rPr>
-                <w:rFonts w:ascii="Times New Roman" w:hAnsi="Times New Roman" w:cs="Times New Roman"/>
-                <w:lang w:val="tr-TR"/>
-              </w:rPr>
-            </w:pPr>
-            <w:r>
-              <w:rPr>
-                <w:rFonts w:ascii="Times New Roman" w:hAnsi="Times New Roman" w:cs="Times New Roman"/>
-                <w:lang w:val="tr-TR"/>
-              </w:rPr>
-              <w:t xml:space="preserve">Shutter ID: 2561760761 (fotoğraf) — Damask rose harvest, bag with pink roses</w:t>
-            </w:r>
-          </w:p>
-        </w:tc>
-      </w:tr>
-    </w:tbl>
+      </w:pPr>
+      <w:r>
+        <w:drawing>
+          <wp:inline xmlns:a="http://schemas.openxmlformats.org/drawingml/2006/main" xmlns:pic="http://schemas.openxmlformats.org/drawingml/2006/picture">
+            <wp:extent cx="4004237" cy="2520000"/>
+            <wp:docPr id="900010" name="Picture 900010"/>
+            <wp:cNvGraphicFramePr>
+              <a:graphicFrameLocks noChangeAspect="1"/>
+            </wp:cNvGraphicFramePr>
+            <a:graphic>
+              <a:graphicData uri="http://schemas.openxmlformats.org/drawingml/2006/picture">
+                <pic:pic>
+                  <pic:nvPicPr>
+                    <pic:cNvPr id="0" name="2561760761_d.jpg"/>
+                    <pic:cNvPicPr/>
+                  </pic:nvPicPr>
+                  <pic:blipFill>
+                    <a:blip r:embed="rId12"/>
+                    <a:stretch>
+                      <a:fillRect/>
+                    </a:stretch>
+                  </pic:blipFill>
+                  <pic:spPr>
+                    <a:xfrm>
+                      <a:off x="0" y="0"/>
+                      <a:ext cx="4004237" cy="2520000"/>
+                    </a:xfrm>
+                    <a:prstGeom prst="rect"/>
+                  </pic:spPr>
+                </pic:pic>
+              </a:graphicData>
+            </a:graphic>
+          </wp:inline>
+        </w:drawing>
+      </w:r>
+    </w:p>
     <w:p>
       <w:pPr>
-        <w:jc w:val="both"/>
-        <w:rPr>
-          <w:rFonts w:ascii="Times New Roman" w:hAnsi="Times New Roman" w:cs="Times New Roman"/>
-          <w:lang w:val="tr-TR"/>
-        </w:rPr>
-      </w:pPr>
+        <w:jc w:val="center"/>
+      </w:pPr>
+      <w:r>
+        <w:rPr>
+          <w:rFonts w:ascii="Times New Roman" w:hAnsi="Times New Roman" w:cs="Times New Roman"/>
+          <w:b/>
+          <w:bCs/>
+          <w:highlight w:val="yellow"/>
+          <w:lang w:val="tr-TR"/>
+        </w:rPr>
+        <w:t xml:space="preserve">Shutter id: 2561760761</w:t>
+      </w:r>
     </w:p>
     <w:p>
       <w:pPr>

</xml_diff>